<commit_message>
GE integrals summary: Arabic word order in tables, parentheses, «يقطع» under zeros, no Arabic inside boxed math
Co-Authored-By: Claude Opus 5.5 <noreply@anthropic.com>
Claude-Session: https://claude.ai/code/session_015WVgZKTbSWpZTjn6aZsqC9
</commit_message>
<xml_diff>
--- a/documents/takamol_ge/molakhas_takamol_3as_ge.docx
+++ b/documents/takamol_ge/molakhas_takamol_3as_ge.docx
@@ -566,118 +566,122 @@
           <w:p>
             <w:pPr>
               <w:bidi/>
+              <w:jc w:val="center"/>
             </w:pPr>
-            <m:oMathPara>
-              <m:oMathParaPr>
-                <m:jc m:val="center"/>
-              </m:oMathParaPr>
-              <m:oMath>
-                <m:borderBox>
-                  <m:e>
-                    <m:r>
-                      <w:rPr>
-                        <w:highlight w:val="yellow"/>
-                      </w:rPr>
-                      <m:t>F</m:t>
-                    </m:r>
-                    <m:r>
-                      <m:rPr>
-                        <m:sty m:val="p"/>
-                      </m:rPr>
-                      <w:rPr>
-                        <w:highlight w:val="yellow"/>
-                      </w:rPr>
-                      <m:t>′</m:t>
-                    </m:r>
-                    <m:d>
-                      <m:dPr>
-                        <m:begChr m:val="("/>
-                        <m:endChr m:val=")"/>
-                        <m:sepChr m:val=""/>
-                        <m:grow/>
-                      </m:dPr>
-                      <m:e>
-                        <m:r>
-                          <w:rPr>
-                            <w:highlight w:val="yellow"/>
-                          </w:rPr>
-                          <m:t>x</m:t>
-                        </m:r>
-                      </m:e>
-                    </m:d>
-                    <m:r>
-                      <m:rPr>
-                        <m:sty m:val="p"/>
-                      </m:rPr>
-                      <w:rPr>
-                        <w:highlight w:val="yellow"/>
-                      </w:rPr>
-                      <m:t>=</m:t>
-                    </m:r>
-                    <m:r>
-                      <w:rPr>
-                        <w:highlight w:val="yellow"/>
-                      </w:rPr>
-                      <m:t>f</m:t>
-                    </m:r>
-                    <m:d>
-                      <m:dPr>
-                        <m:begChr m:val="("/>
-                        <m:endChr m:val=")"/>
-                        <m:sepChr m:val=""/>
-                        <m:grow/>
-                      </m:dPr>
-                      <m:e>
-                        <m:r>
-                          <w:rPr>
-                            <w:highlight w:val="yellow"/>
-                          </w:rPr>
-                          <m:t>x</m:t>
-                        </m:r>
-                      </m:e>
-                    </m:d>
-                    <m:r>
-                      <w:rPr>
-                        <w:highlight w:val="yellow"/>
-                      </w:rPr>
-                      <m:t> </m:t>
-                    </m:r>
-                    <m:r>
-                      <m:rPr>
-                        <m:nor/>
-                        <m:sty m:val="p"/>
-                      </m:rPr>
-                      <w:rPr>
-                        <w:highlight w:val="yellow"/>
-                      </w:rPr>
-                      <m:t>من أجل كل </m:t>
-                    </m:r>
-                    <m:r>
-                      <w:rPr>
-                        <w:highlight w:val="yellow"/>
-                      </w:rPr>
-                      <m:t>x</m:t>
-                    </m:r>
-                    <m:r>
-                      <m:rPr>
-                        <m:nor/>
-                        <m:sty m:val="p"/>
-                      </m:rPr>
-                      <w:rPr>
-                        <w:highlight w:val="yellow"/>
-                      </w:rPr>
-                      <m:t> من </m:t>
-                    </m:r>
-                    <m:r>
-                      <w:rPr>
-                        <w:highlight w:val="yellow"/>
-                      </w:rPr>
-                      <m:t>I</m:t>
-                    </m:r>
-                  </m:e>
-                </m:borderBox>
-              </m:oMath>
-            </m:oMathPara>
+            <m:oMath>
+              <m:borderBox>
+                <m:e>
+                  <m:r>
+                    <w:rPr>
+                      <w:highlight w:val="yellow"/>
+                    </w:rPr>
+                    <m:t>F</m:t>
+                  </m:r>
+                  <m:r>
+                    <m:rPr>
+                      <m:sty m:val="p"/>
+                    </m:rPr>
+                    <w:rPr>
+                      <w:highlight w:val="yellow"/>
+                    </w:rPr>
+                    <m:t>′</m:t>
+                  </m:r>
+                  <m:d>
+                    <m:dPr>
+                      <m:begChr m:val="("/>
+                      <m:endChr m:val=")"/>
+                      <m:sepChr m:val=""/>
+                      <m:grow/>
+                    </m:dPr>
+                    <m:e>
+                      <m:r>
+                        <w:rPr>
+                          <w:highlight w:val="yellow"/>
+                        </w:rPr>
+                        <m:t>x</m:t>
+                      </m:r>
+                    </m:e>
+                  </m:d>
+                  <m:r>
+                    <m:rPr>
+                      <m:sty m:val="p"/>
+                    </m:rPr>
+                    <w:rPr>
+                      <w:highlight w:val="yellow"/>
+                    </w:rPr>
+                    <m:t>=</m:t>
+                  </m:r>
+                  <m:r>
+                    <w:rPr>
+                      <w:highlight w:val="yellow"/>
+                    </w:rPr>
+                    <m:t>f</m:t>
+                  </m:r>
+                  <m:d>
+                    <m:dPr>
+                      <m:begChr m:val="("/>
+                      <m:endChr m:val=")"/>
+                      <m:sepChr m:val=""/>
+                      <m:grow/>
+                    </m:dPr>
+                    <m:e>
+                      <m:r>
+                        <w:rPr>
+                          <w:highlight w:val="yellow"/>
+                        </w:rPr>
+                        <m:t>x</m:t>
+                      </m:r>
+                    </m:e>
+                  </m:d>
+                </m:e>
+              </m:borderBox>
+            </m:oMath>
+            <w:r>
+              <w:rPr>
+                <w:rtl/>
+              </w:rPr>
+              <w:t xml:space="preserve"> </w:t>
+            </w:r>
+            <w:r>
+              <w:rPr>
+                <w:rtl/>
+              </w:rPr>
+              <w:t xml:space="preserve"> من أجل كل</w:t>
+            </w:r>
+            <w:r>
+              <w:rPr>
+                <w:rtl/>
+              </w:rPr>
+              <w:t xml:space="preserve"> </w:t>
+            </w:r>
+            <m:oMath>
+              <m:r>
+                <m:t>x</m:t>
+              </m:r>
+            </m:oMath>
+            <w:r>
+              <w:rPr>
+                <w:rtl/>
+              </w:rPr>
+              <w:t xml:space="preserve"> </w:t>
+            </w:r>
+            <w:r>
+              <w:rPr>
+                <w:rtl/>
+              </w:rPr>
+              <w:t xml:space="preserve">من</w:t>
+            </w:r>
+            <w:r>
+              <w:rPr>
+                <w:rtl/>
+              </w:rPr>
+              <w:t xml:space="preserve"> </w:t>
+            </w:r>
+            <m:oMath>
+              <m:r>
+                <m:t>I</m:t>
+              </m:r>
+            </m:oMath>
           </w:p>
           <w:p>
             <w:pPr>
@@ -1568,7 +1572,13 @@
               <w:rPr>
                 <w:rtl/>
               </w:rPr>
-              <w:t xml:space="preserve">(</w:t>
+              <w:t xml:space="preserve">حيث</w:t>
+            </w:r>
+            <w:r>
+              <w:rPr>
+                <w:rtl/>
+              </w:rPr>
+              <w:t xml:space="preserve"> </w:t>
             </w:r>
             <m:oMath>
               <m:r>
@@ -1585,7 +1595,7 @@
               <w:rPr>
                 <w:rtl/>
               </w:rPr>
-              <w:t xml:space="preserve">عدد حقيقي).</w:t>
+              <w:t xml:space="preserve">عدد حقيقي.</w:t>
             </w:r>
           </w:p>
         </w:tc>
@@ -2790,55 +2800,51 @@
                         </m:r>
                       </m:sup>
                     </m:sSup>
-                  </m:oMath>
-                  <w:r>
-                    <w:rPr>
-                      <w:rtl/>
-                    </w:rPr>
-                    <w:t xml:space="preserve"> </w:t>
-                  </w:r>
-                  <w:r>
-                    <w:rPr>
-                      <w:rtl/>
-                    </w:rPr>
-                    <w:t xml:space="preserve"> (</w:t>
-                  </w:r>
-                  <m:oMath>
-                    <m:r>
-                      <m:t>n</m:t>
-                    </m:r>
-                    <m:r>
-                      <m:rPr>
-                        <m:sty m:val="p"/>
-                      </m:rPr>
-                      <m:t>∈</m:t>
-                    </m:r>
-                    <m:sSup>
+                    <m:r>
+                      <m:t> </m:t>
+                    </m:r>
+                    <m:r>
+                      <m:t> </m:t>
+                    </m:r>
+                    <m:d>
+                      <m:dPr>
+                        <m:begChr m:val="("/>
+                        <m:endChr m:val=")"/>
+                        <m:sepChr m:val=""/>
+                        <m:grow/>
+                      </m:dPr>
                       <m:e>
                         <m:r>
-                          <m:rPr>
-                            <m:sty m:val="p"/>
-                            <m:scr m:val="double-struck"/>
-                          </m:rPr>
-                          <m:t>N</m:t>
+                          <m:t>n</m:t>
                         </m:r>
-                      </m:e>
-                      <m:sup>
                         <m:r>
                           <m:rPr>
                             <m:sty m:val="p"/>
                           </m:rPr>
-                          <m:t>*</m:t>
+                          <m:t>∈</m:t>
                         </m:r>
-                      </m:sup>
-                    </m:sSup>
+                        <m:sSup>
+                          <m:e>
+                            <m:r>
+                              <m:rPr>
+                                <m:sty m:val="p"/>
+                                <m:scr m:val="double-struck"/>
+                              </m:rPr>
+                              <m:t>N</m:t>
+                            </m:r>
+                          </m:e>
+                          <m:sup>
+                            <m:r>
+                              <m:rPr>
+                                <m:sty m:val="p"/>
+                              </m:rPr>
+                              <m:t>*</m:t>
+                            </m:r>
+                          </m:sup>
+                        </m:sSup>
+                      </m:e>
+                    </m:d>
                   </m:oMath>
-                  <w:r>
-                    <w:rPr>
-                      <w:rtl/>
-                    </w:rPr>
-                    <w:t xml:space="preserve">)</w:t>
-                  </w:r>
                 </w:p>
               </w:tc>
             </w:tr>
@@ -4586,7 +4592,7 @@
           <w:tbl>
             <w:tblPr>
               <w:tblStyle w:val="Table"/>
-              <w:tblW w:w="8595" w:type="dxa"/>
+              <w:tblW w:w="8215" w:type="dxa"/>
               <w:jc w:val="center"/>
               <w:tblBorders>
                 <w:top w:val="single" w:sz="4" w:space="0" w:color="000000"/>
@@ -4602,7 +4608,7 @@
             <w:tblGrid>
               <w:gridCol w:w="2485"/>
               <w:gridCol w:w="3245"/>
-              <w:gridCol w:w="2865"/>
+              <w:gridCol w:w="2485"/>
             </w:tblGrid>
             <w:tr>
               <w:trPr>
@@ -4659,7 +4665,7 @@
               </w:tc>
               <w:tc>
                 <w:tcPr>
-                  <w:tcW w:w="2865" w:type="dxa"/>
+                  <w:tcW w:w="2485" w:type="dxa"/>
                   <w:shd w:val="clear" w:color="auto" w:fill="E4E7ED"/>
                 </w:tcPr>
                 <w:p>
@@ -4759,7 +4765,7 @@
               </w:tc>
               <w:tc>
                 <w:tcPr>
-                  <w:tcW w:w="2865" w:type="dxa"/>
+                  <w:tcW w:w="2485" w:type="dxa"/>
                 </w:tcPr>
                 <w:p>
                   <w:pPr>
@@ -4873,7 +4879,7 @@
               </w:tc>
               <w:tc>
                 <w:tcPr>
-                  <w:tcW w:w="2865" w:type="dxa"/>
+                  <w:tcW w:w="2485" w:type="dxa"/>
                 </w:tcPr>
                 <w:p>
                   <w:pPr>
@@ -4903,55 +4909,51 @@
                         </m:r>
                       </m:sup>
                     </m:sSup>
-                  </m:oMath>
-                  <w:r>
-                    <w:rPr>
-                      <w:rtl/>
-                    </w:rPr>
-                    <w:t xml:space="preserve"> </w:t>
-                  </w:r>
-                  <w:r>
-                    <w:rPr>
-                      <w:rtl/>
-                    </w:rPr>
-                    <w:t xml:space="preserve"> (</w:t>
-                  </w:r>
-                  <m:oMath>
-                    <m:r>
-                      <m:t>n</m:t>
-                    </m:r>
-                    <m:r>
-                      <m:rPr>
-                        <m:sty m:val="p"/>
-                      </m:rPr>
-                      <m:t>∈</m:t>
-                    </m:r>
-                    <m:sSup>
+                    <m:r>
+                      <m:t> </m:t>
+                    </m:r>
+                    <m:r>
+                      <m:t> </m:t>
+                    </m:r>
+                    <m:d>
+                      <m:dPr>
+                        <m:begChr m:val="("/>
+                        <m:endChr m:val=")"/>
+                        <m:sepChr m:val=""/>
+                        <m:grow/>
+                      </m:dPr>
                       <m:e>
                         <m:r>
-                          <m:rPr>
-                            <m:sty m:val="p"/>
-                            <m:scr m:val="double-struck"/>
-                          </m:rPr>
-                          <m:t>N</m:t>
+                          <m:t>n</m:t>
                         </m:r>
-                      </m:e>
-                      <m:sup>
                         <m:r>
                           <m:rPr>
                             <m:sty m:val="p"/>
                           </m:rPr>
-                          <m:t>*</m:t>
+                          <m:t>∈</m:t>
                         </m:r>
-                      </m:sup>
-                    </m:sSup>
+                        <m:sSup>
+                          <m:e>
+                            <m:r>
+                              <m:rPr>
+                                <m:sty m:val="p"/>
+                                <m:scr m:val="double-struck"/>
+                              </m:rPr>
+                              <m:t>N</m:t>
+                            </m:r>
+                          </m:e>
+                          <m:sup>
+                            <m:r>
+                              <m:rPr>
+                                <m:sty m:val="p"/>
+                              </m:rPr>
+                              <m:t>*</m:t>
+                            </m:r>
+                          </m:sup>
+                        </m:sSup>
+                      </m:e>
+                    </m:d>
                   </m:oMath>
-                  <w:r>
-                    <w:rPr>
-                      <w:rtl/>
-                    </w:rPr>
-                    <w:t xml:space="preserve">)</w:t>
-                  </w:r>
                 </w:p>
               </w:tc>
             </w:tr>
@@ -5064,7 +5066,7 @@
               </w:tc>
               <w:tc>
                 <w:tcPr>
-                  <w:tcW w:w="2865" w:type="dxa"/>
+                  <w:tcW w:w="2485" w:type="dxa"/>
                 </w:tcPr>
                 <w:p>
                   <w:pPr>
@@ -5256,7 +5258,7 @@
               </w:tc>
               <w:tc>
                 <w:tcPr>
-                  <w:tcW w:w="2865" w:type="dxa"/>
+                  <w:tcW w:w="2485" w:type="dxa"/>
                 </w:tcPr>
                 <w:p>
                   <w:pPr>
@@ -5295,39 +5297,35 @@
                         </m:sSup>
                       </m:den>
                     </m:f>
+                    <m:r>
+                      <m:t> </m:t>
+                    </m:r>
+                    <m:r>
+                      <m:t> </m:t>
+                    </m:r>
+                    <m:d>
+                      <m:dPr>
+                        <m:begChr m:val="("/>
+                        <m:endChr m:val=")"/>
+                        <m:sepChr m:val=""/>
+                        <m:grow/>
+                      </m:dPr>
+                      <m:e>
+                        <m:r>
+                          <m:t>n</m:t>
+                        </m:r>
+                        <m:r>
+                          <m:rPr>
+                            <m:sty m:val="p"/>
+                          </m:rPr>
+                          <m:t>≥</m:t>
+                        </m:r>
+                        <m:r>
+                          <m:t>2</m:t>
+                        </m:r>
+                      </m:e>
+                    </m:d>
                   </m:oMath>
-                  <w:r>
-                    <w:rPr>
-                      <w:rtl/>
-                    </w:rPr>
-                    <w:t xml:space="preserve"> </w:t>
-                  </w:r>
-                  <w:r>
-                    <w:rPr>
-                      <w:rtl/>
-                    </w:rPr>
-                    <w:t xml:space="preserve"> (</w:t>
-                  </w:r>
-                  <m:oMath>
-                    <m:r>
-                      <m:t>n</m:t>
-                    </m:r>
-                    <m:r>
-                      <m:rPr>
-                        <m:sty m:val="p"/>
-                      </m:rPr>
-                      <m:t>≥</m:t>
-                    </m:r>
-                    <m:r>
-                      <m:t>2</m:t>
-                    </m:r>
-                  </m:oMath>
-                  <w:r>
-                    <w:rPr>
-                      <w:rtl/>
-                    </w:rPr>
-                    <w:t xml:space="preserve">)</w:t>
-                  </w:r>
                 </w:p>
               </w:tc>
             </w:tr>
@@ -5433,7 +5431,7 @@
               </w:tc>
               <w:tc>
                 <w:tcPr>
-                  <w:tcW w:w="2865" w:type="dxa"/>
+                  <w:tcW w:w="2485" w:type="dxa"/>
                 </w:tcPr>
                 <w:p>
                   <w:pPr>
@@ -10642,7 +10640,7 @@
                     <a:graphicData uri="http://schemas.openxmlformats.org/drawingml/2006/picture">
                       <pic:pic>
                         <pic:nvPicPr>
-                          <pic:cNvPr id="0" name="85c9f63ccc9101f9.png"/>
+                          <pic:cNvPr id="0" name="7cf75eedb6448c44.png"/>
                           <pic:cNvPicPr/>
                         </pic:nvPicPr>
                         <pic:blipFill>
@@ -12741,7 +12739,7 @@
                           <a:graphicData uri="http://schemas.openxmlformats.org/drawingml/2006/picture">
                             <pic:pic>
                               <pic:nvPicPr>
-                                <pic:cNvPr id="0" name="852cc3d843729fe1.png"/>
+                                <pic:cNvPr id="0" name="d46c0a8412a22da4.png"/>
                                 <pic:cNvPicPr/>
                               </pic:nvPicPr>
                               <pic:blipFill>
@@ -16762,7 +16760,7 @@
                           <a:graphicData uri="http://schemas.openxmlformats.org/drawingml/2006/picture">
                             <pic:pic>
                               <pic:nvPicPr>
-                                <pic:cNvPr id="0" name="f6ab9ea3894820e3.png"/>
+                                <pic:cNvPr id="0" name="da298e1e45a96aa0.png"/>
                                 <pic:cNvPicPr/>
                               </pic:nvPicPr>
                               <pic:blipFill>
@@ -20393,7 +20391,7 @@
                     <a:graphicData uri="http://schemas.openxmlformats.org/drawingml/2006/picture">
                       <pic:pic>
                         <pic:nvPicPr>
-                          <pic:cNvPr id="0" name="2df829546d6947ef.png"/>
+                          <pic:cNvPr id="0" name="62fd9a4e81860377.png"/>
                           <pic:cNvPicPr/>
                         </pic:nvPicPr>
                         <pic:blipFill>
@@ -22055,7 +22053,7 @@
                     <a:graphicData uri="http://schemas.openxmlformats.org/drawingml/2006/picture">
                       <pic:pic>
                         <pic:nvPicPr>
-                          <pic:cNvPr id="0" name="68c787aa7c4d8bea.png"/>
+                          <pic:cNvPr id="0" name="cbe0ecc641ae9694.png"/>
                           <pic:cNvPicPr/>
                         </pic:nvPicPr>
                         <pic:blipFill>
@@ -24475,7 +24473,7 @@
                     <a:graphicData uri="http://schemas.openxmlformats.org/drawingml/2006/picture">
                       <pic:pic>
                         <pic:nvPicPr>
-                          <pic:cNvPr id="0" name="4f7000718a650591.png"/>
+                          <pic:cNvPr id="0" name="bbb5f0b18b807e59.png"/>
                           <pic:cNvPicPr/>
                         </pic:nvPicPr>
                         <pic:blipFill>
@@ -27843,7 +27841,7 @@
                     <a:graphicData uri="http://schemas.openxmlformats.org/drawingml/2006/picture">
                       <pic:pic>
                         <pic:nvPicPr>
-                          <pic:cNvPr id="0" name="327c36cb3b991034.png"/>
+                          <pic:cNvPr id="0" name="0da3f4a7f09bc722.png"/>
                           <pic:cNvPicPr/>
                         </pic:nvPicPr>
                         <pic:blipFill>

</xml_diff>

<commit_message>
GE integrals summary: relative-position tables drawn in TikZ (teacher's model, intersection cell under each zero)
Co-Authored-By: Claude Opus 5.5 <noreply@anthropic.com>
Claude-Session: https://claude.ai/code/session_015WVgZKTbSWpZTjn6aZsqC9
</commit_message>
<xml_diff>
--- a/documents/takamol_ge/molakhas_takamol_3as_ge.docx
+++ b/documents/takamol_ge/molakhas_takamol_3as_ge.docx
@@ -10640,7 +10640,7 @@
                     <a:graphicData uri="http://schemas.openxmlformats.org/drawingml/2006/picture">
                       <pic:pic>
                         <pic:nvPicPr>
-                          <pic:cNvPr id="0" name="7cf75eedb6448c44.png"/>
+                          <pic:cNvPr id="0" name="85c9f63ccc9101f9.png"/>
                           <pic:cNvPicPr/>
                         </pic:nvPicPr>
                         <pic:blipFill>
@@ -12739,7 +12739,7 @@
                           <a:graphicData uri="http://schemas.openxmlformats.org/drawingml/2006/picture">
                             <pic:pic>
                               <pic:nvPicPr>
-                                <pic:cNvPr id="0" name="d46c0a8412a22da4.png"/>
+                                <pic:cNvPr id="0" name="852cc3d843729fe1.png"/>
                                 <pic:cNvPicPr/>
                               </pic:nvPicPr>
                               <pic:blipFill>
@@ -16760,7 +16760,7 @@
                           <a:graphicData uri="http://schemas.openxmlformats.org/drawingml/2006/picture">
                             <pic:pic>
                               <pic:nvPicPr>
-                                <pic:cNvPr id="0" name="da298e1e45a96aa0.png"/>
+                                <pic:cNvPr id="0" name="f6ab9ea3894820e3.png"/>
                                 <pic:cNvPicPr/>
                               </pic:nvPicPr>
                               <pic:blipFill>
@@ -19899,481 +19899,9 @@
               <w:t xml:space="preserve">:</w:t>
             </w:r>
           </w:p>
-          <w:tbl>
-            <w:tblPr>
-              <w:tblStyle w:val="Table"/>
-              <w:tblW w:w="9521" w:type="dxa"/>
-              <w:jc w:val="center"/>
-              <w:tblBorders>
-                <w:top w:val="single" w:sz="4" w:space="0" w:color="000000"/>
-                <w:left w:val="single" w:sz="4" w:space="0" w:color="000000"/>
-                <w:bottom w:val="single" w:sz="4" w:space="0" w:color="000000"/>
-                <w:right w:val="single" w:sz="4" w:space="0" w:color="000000"/>
-                <w:insideH w:val="single" w:sz="4" w:space="0" w:color="000000"/>
-                <w:insideV w:val="single" w:sz="4" w:space="0" w:color="000000"/>
-              </w:tblBorders>
-              <w:tblLayout w:type="fixed"/>
-              <w:tblLook w:firstRow="1" w:lastRow="0" w:firstColumn="0" w:lastColumn="0" w:noHBand="0" w:noVBand="0" w:val="0020"/>
-            </w:tblPr>
-            <w:tblGrid>
-              <w:gridCol w:w="2612"/>
-              <w:gridCol w:w="793"/>
-              <w:gridCol w:w="2265"/>
-              <w:gridCol w:w="793"/>
-              <w:gridCol w:w="2265"/>
-              <w:gridCol w:w="793"/>
-            </w:tblGrid>
-            <w:tr>
-              <w:trPr>
-                <w:tblHeader w:val="true"/>
-              </w:trPr>
-              <w:tc>
-                <w:tcPr>
-                  <w:tcW w:w="2612" w:type="dxa"/>
-                  <w:shd w:val="clear" w:color="auto" w:fill="E4E7ED"/>
-                </w:tcPr>
-                <w:p>
-                  <w:pPr>
-                    <w:pStyle w:val="Compact"/>
-                    <w:bidi/>
-                    <w:jc w:val="center"/>
-                  </w:pPr>
-                  <w:r>
-                    <w:rPr>
-                      <w:rtl/>
-                    </w:rPr>
-                    <w:t xml:space="preserve"/>
-                  </w:r>
-                  <m:oMath>
-                    <m:r>
-                      <m:t>x</m:t>
-                    </m:r>
-                  </m:oMath>
-                </w:p>
-              </w:tc>
-              <w:tc>
-                <w:tcPr>
-                  <w:tcW w:w="793" w:type="dxa"/>
-                  <w:shd w:val="clear" w:color="auto" w:fill="E4E7ED"/>
-                </w:tcPr>
-                <w:p>
-                  <w:pPr>
-                    <w:pStyle w:val="Compact"/>
-                    <w:bidi/>
-                    <w:jc w:val="center"/>
-                  </w:pPr>
-                  <m:oMath>
-                    <m:r>
-                      <m:t>0</m:t>
-                    </m:r>
-                  </m:oMath>
-                </w:p>
-              </w:tc>
-              <w:tc>
-                <w:tcPr>
-                  <w:tcW w:w="2265" w:type="dxa"/>
-                  <w:shd w:val="clear" w:color="auto" w:fill="E4E7ED"/>
-                </w:tcPr>
-                <w:p>
-                  <w:pPr>
-                    <w:pStyle w:val="Compact"/>
-                    <w:bidi/>
-                    <w:jc w:val="center"/>
-                  </w:pPr>
-                </w:p>
-              </w:tc>
-              <w:tc>
-                <w:tcPr>
-                  <w:tcW w:w="793" w:type="dxa"/>
-                  <w:shd w:val="clear" w:color="auto" w:fill="E4E7ED"/>
-                </w:tcPr>
-                <w:p>
-                  <w:pPr>
-                    <w:pStyle w:val="Compact"/>
-                    <w:bidi/>
-                    <w:jc w:val="center"/>
-                  </w:pPr>
-                  <m:oMath>
-                    <m:r>
-                      <m:t>1</m:t>
-                    </m:r>
-                  </m:oMath>
-                </w:p>
-              </w:tc>
-              <w:tc>
-                <w:tcPr>
-                  <w:tcW w:w="2265" w:type="dxa"/>
-                  <w:shd w:val="clear" w:color="auto" w:fill="E4E7ED"/>
-                </w:tcPr>
-                <w:p>
-                  <w:pPr>
-                    <w:pStyle w:val="Compact"/>
-                    <w:bidi/>
-                    <w:jc w:val="center"/>
-                  </w:pPr>
-                </w:p>
-              </w:tc>
-              <w:tc>
-                <w:tcPr>
-                  <w:tcW w:w="793" w:type="dxa"/>
-                  <w:shd w:val="clear" w:color="auto" w:fill="E4E7ED"/>
-                </w:tcPr>
-                <w:p>
-                  <w:pPr>
-                    <w:pStyle w:val="Compact"/>
-                    <w:bidi/>
-                    <w:jc w:val="center"/>
-                  </w:pPr>
-                  <m:oMath>
-                    <m:r>
-                      <m:t>2</m:t>
-                    </m:r>
-                  </m:oMath>
-                </w:p>
-              </w:tc>
-            </w:tr>
-            <w:tr>
-              <w:tc>
-                <w:tcPr>
-                  <w:tcW w:w="2612" w:type="dxa"/>
-                </w:tcPr>
-                <w:p>
-                  <w:pPr>
-                    <w:pStyle w:val="Compact"/>
-                    <w:bidi/>
-                    <w:jc w:val="center"/>
-                  </w:pPr>
-                  <w:r>
-                    <w:rPr>
-                      <w:rtl/>
-                    </w:rPr>
-                    <w:t xml:space="preserve">إشارة</w:t>
-                  </w:r>
-                  <w:r>
-                    <w:rPr>
-                      <w:rtl/>
-                    </w:rPr>
-                    <w:t xml:space="preserve"> </w:t>
-                  </w:r>
-                  <m:oMath>
-                    <m:r>
-                      <m:t>f</m:t>
-                    </m:r>
-                    <m:d>
-                      <m:dPr>
-                        <m:begChr m:val="("/>
-                        <m:endChr m:val=")"/>
-                        <m:sepChr m:val=""/>
-                        <m:grow/>
-                      </m:dPr>
-                      <m:e>
-                        <m:r>
-                          <m:t>x</m:t>
-                        </m:r>
-                      </m:e>
-                    </m:d>
-                  </m:oMath>
-                </w:p>
-              </w:tc>
-              <w:tc>
-                <w:tcPr>
-                  <w:tcW w:w="793" w:type="dxa"/>
-                </w:tcPr>
-                <w:p>
-                  <w:pPr>
-                    <w:pStyle w:val="Compact"/>
-                    <w:bidi/>
-                    <w:jc w:val="center"/>
-                  </w:pPr>
-                </w:p>
-              </w:tc>
-              <w:tc>
-                <w:tcPr>
-                  <w:tcW w:w="2265" w:type="dxa"/>
-                </w:tcPr>
-                <w:p>
-                  <w:pPr>
-                    <w:pStyle w:val="Compact"/>
-                    <w:bidi/>
-                    <w:jc w:val="center"/>
-                  </w:pPr>
-                  <m:oMath>
-                    <m:r>
-                      <m:rPr>
-                        <m:sty m:val="p"/>
-                      </m:rPr>
-                      <m:t>−</m:t>
-                    </m:r>
-                  </m:oMath>
-                </w:p>
-              </w:tc>
-              <w:tc>
-                <w:tcPr>
-                  <w:tcW w:w="793" w:type="dxa"/>
-                </w:tcPr>
-                <w:p>
-                  <w:pPr>
-                    <w:pStyle w:val="Compact"/>
-                    <w:bidi/>
-                    <w:jc w:val="center"/>
-                  </w:pPr>
-                  <m:oMath>
-                    <m:r>
-                      <m:t>0</m:t>
-                    </m:r>
-                  </m:oMath>
-                </w:p>
-              </w:tc>
-              <w:tc>
-                <w:tcPr>
-                  <w:tcW w:w="2265" w:type="dxa"/>
-                </w:tcPr>
-                <w:p>
-                  <w:pPr>
-                    <w:pStyle w:val="Compact"/>
-                    <w:bidi/>
-                    <w:jc w:val="center"/>
-                  </w:pPr>
-                  <m:oMath>
-                    <m:r>
-                      <m:rPr>
-                        <m:sty m:val="p"/>
-                      </m:rPr>
-                      <m:t>+</m:t>
-                    </m:r>
-                  </m:oMath>
-                </w:p>
-              </w:tc>
-              <w:tc>
-                <w:tcPr>
-                  <w:tcW w:w="793" w:type="dxa"/>
-                </w:tcPr>
-                <w:p>
-                  <w:pPr>
-                    <w:pStyle w:val="Compact"/>
-                    <w:bidi/>
-                    <w:jc w:val="center"/>
-                  </w:pPr>
-                </w:p>
-              </w:tc>
-            </w:tr>
-            <w:tr>
-              <w:tc>
-                <w:tcPr>
-                  <w:tcW w:w="2612" w:type="dxa"/>
-                </w:tcPr>
-                <w:p>
-                  <w:pPr>
-                    <w:pStyle w:val="Compact"/>
-                    <w:bidi/>
-                    <w:jc w:val="center"/>
-                  </w:pPr>
-                  <w:r>
-                    <w:rPr>
-                      <w:rtl/>
-                    </w:rPr>
-                    <w:t xml:space="preserve">الوضع النسبي</w:t>
-                  </w:r>
-                </w:p>
-              </w:tc>
-              <w:tc>
-                <w:tcPr>
-                  <w:tcW w:w="793" w:type="dxa"/>
-                </w:tcPr>
-                <w:p>
-                  <w:pPr>
-                    <w:pStyle w:val="Compact"/>
-                    <w:bidi/>
-                    <w:jc w:val="center"/>
-                  </w:pPr>
-                </w:p>
-              </w:tc>
-              <w:tc>
-                <w:tcPr>
-                  <w:tcW w:w="2265" w:type="dxa"/>
-                </w:tcPr>
-                <w:p>
-                  <w:pPr>
-                    <w:pStyle w:val="Compact"/>
-                    <w:bidi/>
-                    <w:jc w:val="center"/>
-                  </w:pPr>
-                  <m:oMath>
-                    <m:d>
-                      <m:dPr>
-                        <m:begChr m:val="("/>
-                        <m:endChr m:val=")"/>
-                        <m:sepChr m:val=""/>
-                        <m:grow/>
-                      </m:dPr>
-                      <m:e>
-                        <m:sSub>
-                          <m:e>
-                            <m:r>
-                              <m:t>C</m:t>
-                            </m:r>
-                          </m:e>
-                          <m:sub>
-                            <m:r>
-                              <m:t>f</m:t>
-                            </m:r>
-                          </m:sub>
-                        </m:sSub>
-                      </m:e>
-                    </m:d>
-                  </m:oMath>
-                  <w:r>
-                    <w:rPr>
-                      <w:rtl/>
-                    </w:rPr>
-                    <w:t xml:space="preserve"> </w:t>
-                  </w:r>
-                  <w:r>
-                    <w:rPr>
-                      <w:rtl/>
-                    </w:rPr>
-                    <w:t xml:space="preserve">تحت</w:t>
-                  </w:r>
-                  <w:r>
-                    <w:rPr>
-                      <w:rtl/>
-                    </w:rPr>
-                    <w:t xml:space="preserve"> </w:t>
-                  </w:r>
-                  <m:oMath>
-                    <m:d>
-                      <m:dPr>
-                        <m:begChr m:val="("/>
-                        <m:endChr m:val=")"/>
-                        <m:sepChr m:val=""/>
-                        <m:grow/>
-                      </m:dPr>
-                      <m:e>
-                        <m:r>
-                          <m:t>x</m:t>
-                        </m:r>
-                        <m:r>
-                          <m:t>x</m:t>
-                        </m:r>
-                        <m:r>
-                          <m:rPr>
-                            <m:sty m:val="p"/>
-                          </m:rPr>
-                          <m:t>′</m:t>
-                        </m:r>
-                      </m:e>
-                    </m:d>
-                  </m:oMath>
-                </w:p>
-              </w:tc>
-              <w:tc>
-                <w:tcPr>
-                  <w:tcW w:w="793" w:type="dxa"/>
-                </w:tcPr>
-                <w:p>
-                  <w:pPr>
-                    <w:pStyle w:val="Compact"/>
-                    <w:bidi/>
-                    <w:jc w:val="center"/>
-                  </w:pPr>
-                </w:p>
-              </w:tc>
-              <w:tc>
-                <w:tcPr>
-                  <w:tcW w:w="2265" w:type="dxa"/>
-                </w:tcPr>
-                <w:p>
-                  <w:pPr>
-                    <w:pStyle w:val="Compact"/>
-                    <w:bidi/>
-                    <w:jc w:val="center"/>
-                  </w:pPr>
-                  <m:oMath>
-                    <m:d>
-                      <m:dPr>
-                        <m:begChr m:val="("/>
-                        <m:endChr m:val=")"/>
-                        <m:sepChr m:val=""/>
-                        <m:grow/>
-                      </m:dPr>
-                      <m:e>
-                        <m:sSub>
-                          <m:e>
-                            <m:r>
-                              <m:t>C</m:t>
-                            </m:r>
-                          </m:e>
-                          <m:sub>
-                            <m:r>
-                              <m:t>f</m:t>
-                            </m:r>
-                          </m:sub>
-                        </m:sSub>
-                      </m:e>
-                    </m:d>
-                  </m:oMath>
-                  <w:r>
-                    <w:rPr>
-                      <w:rtl/>
-                    </w:rPr>
-                    <w:t xml:space="preserve"> </w:t>
-                  </w:r>
-                  <w:r>
-                    <w:rPr>
-                      <w:rtl/>
-                    </w:rPr>
-                    <w:t xml:space="preserve">فوق</w:t>
-                  </w:r>
-                  <w:r>
-                    <w:rPr>
-                      <w:rtl/>
-                    </w:rPr>
-                    <w:t xml:space="preserve"> </w:t>
-                  </w:r>
-                  <m:oMath>
-                    <m:d>
-                      <m:dPr>
-                        <m:begChr m:val="("/>
-                        <m:endChr m:val=")"/>
-                        <m:sepChr m:val=""/>
-                        <m:grow/>
-                      </m:dPr>
-                      <m:e>
-                        <m:r>
-                          <m:t>x</m:t>
-                        </m:r>
-                        <m:r>
-                          <m:t>x</m:t>
-                        </m:r>
-                        <m:r>
-                          <m:rPr>
-                            <m:sty m:val="p"/>
-                          </m:rPr>
-                          <m:t>′</m:t>
-                        </m:r>
-                      </m:e>
-                    </m:d>
-                  </m:oMath>
-                </w:p>
-              </w:tc>
-              <w:tc>
-                <w:tcPr>
-                  <w:tcW w:w="793" w:type="dxa"/>
-                </w:tcPr>
-                <w:p>
-                  <w:pPr>
-                    <w:pStyle w:val="Compact"/>
-                    <w:bidi/>
-                    <w:jc w:val="center"/>
-                  </w:pPr>
-                </w:p>
-              </w:tc>
-            </w:tr>
-          </w:tbl>
           <w:p>
             <w:pPr>
               <w:bidi/>
-              <w:spacing w:before="120"/>
               <w:jc w:val="center"/>
             </w:pPr>
             <w:r>
@@ -20382,7 +19910,7 @@
               </w:rPr>
               <w:drawing>
                 <wp:inline>
-                  <wp:extent cx="1833372" cy="1449324"/>
+                  <wp:extent cx="5628132" cy="1700784"/>
                   <wp:docPr id="4" name="Picture 4"/>
                   <wp:cNvGraphicFramePr>
                     <a:graphicFrameLocks noChangeAspect="1"/>
@@ -20391,11 +19919,54 @@
                     <a:graphicData uri="http://schemas.openxmlformats.org/drawingml/2006/picture">
                       <pic:pic>
                         <pic:nvPicPr>
-                          <pic:cNvPr id="0" name="62fd9a4e81860377.png"/>
+                          <pic:cNvPr id="0" name="0bd620037f676f87.png"/>
                           <pic:cNvPicPr/>
                         </pic:nvPicPr>
                         <pic:blipFill>
                           <a:blip r:embed="rId12"/>
+                          <a:stretch>
+                            <a:fillRect/>
+                          </a:stretch>
+                        </pic:blipFill>
+                        <pic:spPr>
+                          <a:xfrm>
+                            <a:off x="0" y="0"/>
+                            <a:ext cx="5628132" cy="1700784"/>
+                          </a:xfrm>
+                          <a:prstGeom prst="rect"/>
+                        </pic:spPr>
+                      </pic:pic>
+                    </a:graphicData>
+                  </a:graphic>
+                </wp:inline>
+              </w:drawing>
+            </w:r>
+          </w:p>
+          <w:p>
+            <w:pPr>
+              <w:bidi/>
+              <w:jc w:val="center"/>
+            </w:pPr>
+            <w:r>
+              <w:rPr>
+                <w:rtl/>
+              </w:rPr>
+              <w:drawing>
+                <wp:inline>
+                  <wp:extent cx="1833372" cy="1449324"/>
+                  <wp:docPr id="5" name="Picture 5"/>
+                  <wp:cNvGraphicFramePr>
+                    <a:graphicFrameLocks noChangeAspect="1"/>
+                  </wp:cNvGraphicFramePr>
+                  <a:graphic>
+                    <a:graphicData uri="http://schemas.openxmlformats.org/drawingml/2006/picture">
+                      <pic:pic>
+                        <pic:nvPicPr>
+                          <pic:cNvPr id="0" name="2df829546d6947ef.png"/>
+                          <pic:cNvPicPr/>
+                        </pic:nvPicPr>
+                        <pic:blipFill>
+                          <a:blip r:embed="rId13"/>
                           <a:stretch>
                             <a:fillRect/>
                           </a:stretch>
@@ -21689,353 +21260,9 @@
               <w:t xml:space="preserve">:</w:t>
             </w:r>
           </w:p>
-          <w:tbl>
-            <w:tblPr>
-              <w:tblStyle w:val="Table"/>
-              <w:tblW w:w="6900" w:type="dxa"/>
-              <w:jc w:val="center"/>
-              <w:tblBorders>
-                <w:top w:val="single" w:sz="4" w:space="0" w:color="000000"/>
-                <w:left w:val="single" w:sz="4" w:space="0" w:color="000000"/>
-                <w:bottom w:val="single" w:sz="4" w:space="0" w:color="000000"/>
-                <w:right w:val="single" w:sz="4" w:space="0" w:color="000000"/>
-                <w:insideH w:val="single" w:sz="4" w:space="0" w:color="000000"/>
-                <w:insideV w:val="single" w:sz="4" w:space="0" w:color="000000"/>
-              </w:tblBorders>
-              <w:tblLayout w:type="fixed"/>
-              <w:tblLook w:firstRow="1" w:lastRow="0" w:firstColumn="0" w:lastColumn="0" w:noHBand="0" w:noVBand="0" w:val="0020"/>
-            </w:tblPr>
-            <w:tblGrid>
-              <w:gridCol w:w="2865"/>
-              <w:gridCol w:w="870"/>
-              <w:gridCol w:w="2295"/>
-              <w:gridCol w:w="870"/>
-            </w:tblGrid>
-            <w:tr>
-              <w:trPr>
-                <w:tblHeader w:val="true"/>
-              </w:trPr>
-              <w:tc>
-                <w:tcPr>
-                  <w:tcW w:w="2865" w:type="dxa"/>
-                  <w:shd w:val="clear" w:color="auto" w:fill="E4E7ED"/>
-                </w:tcPr>
-                <w:p>
-                  <w:pPr>
-                    <w:pStyle w:val="Compact"/>
-                    <w:bidi/>
-                    <w:jc w:val="center"/>
-                  </w:pPr>
-                  <w:r>
-                    <w:rPr>
-                      <w:rtl/>
-                    </w:rPr>
-                    <w:t xml:space="preserve"/>
-                  </w:r>
-                  <m:oMath>
-                    <m:r>
-                      <m:t>x</m:t>
-                    </m:r>
-                  </m:oMath>
-                </w:p>
-              </w:tc>
-              <w:tc>
-                <w:tcPr>
-                  <w:tcW w:w="870" w:type="dxa"/>
-                  <w:shd w:val="clear" w:color="auto" w:fill="E4E7ED"/>
-                </w:tcPr>
-                <w:p>
-                  <w:pPr>
-                    <w:pStyle w:val="Compact"/>
-                    <w:bidi/>
-                    <w:jc w:val="center"/>
-                  </w:pPr>
-                  <m:oMath>
-                    <m:r>
-                      <m:t>0</m:t>
-                    </m:r>
-                  </m:oMath>
-                </w:p>
-              </w:tc>
-              <w:tc>
-                <w:tcPr>
-                  <w:tcW w:w="2295" w:type="dxa"/>
-                  <w:shd w:val="clear" w:color="auto" w:fill="E4E7ED"/>
-                </w:tcPr>
-                <w:p>
-                  <w:pPr>
-                    <w:pStyle w:val="Compact"/>
-                    <w:bidi/>
-                    <w:jc w:val="center"/>
-                  </w:pPr>
-                </w:p>
-              </w:tc>
-              <w:tc>
-                <w:tcPr>
-                  <w:tcW w:w="870" w:type="dxa"/>
-                  <w:shd w:val="clear" w:color="auto" w:fill="E4E7ED"/>
-                </w:tcPr>
-                <w:p>
-                  <w:pPr>
-                    <w:pStyle w:val="Compact"/>
-                    <w:bidi/>
-                    <w:jc w:val="center"/>
-                  </w:pPr>
-                  <m:oMath>
-                    <m:r>
-                      <m:t>3</m:t>
-                    </m:r>
-                  </m:oMath>
-                </w:p>
-              </w:tc>
-            </w:tr>
-            <w:tr>
-              <w:tc>
-                <w:tcPr>
-                  <w:tcW w:w="2865" w:type="dxa"/>
-                </w:tcPr>
-                <w:p>
-                  <w:pPr>
-                    <w:pStyle w:val="Compact"/>
-                    <w:bidi/>
-                    <w:jc w:val="center"/>
-                  </w:pPr>
-                  <w:r>
-                    <w:rPr>
-                      <w:rtl/>
-                    </w:rPr>
-                    <w:t xml:space="preserve">إشارة</w:t>
-                  </w:r>
-                  <w:r>
-                    <w:rPr>
-                      <w:rtl/>
-                    </w:rPr>
-                    <w:t xml:space="preserve"> </w:t>
-                  </w:r>
-                  <m:oMath>
-                    <m:r>
-                      <m:t>f</m:t>
-                    </m:r>
-                    <m:d>
-                      <m:dPr>
-                        <m:begChr m:val="("/>
-                        <m:endChr m:val=")"/>
-                        <m:sepChr m:val=""/>
-                        <m:grow/>
-                      </m:dPr>
-                      <m:e>
-                        <m:r>
-                          <m:t>x</m:t>
-                        </m:r>
-                      </m:e>
-                    </m:d>
-                    <m:r>
-                      <m:rPr>
-                        <m:sty m:val="p"/>
-                      </m:rPr>
-                      <m:t>−</m:t>
-                    </m:r>
-                    <m:r>
-                      <m:t>g</m:t>
-                    </m:r>
-                    <m:d>
-                      <m:dPr>
-                        <m:begChr m:val="("/>
-                        <m:endChr m:val=")"/>
-                        <m:sepChr m:val=""/>
-                        <m:grow/>
-                      </m:dPr>
-                      <m:e>
-                        <m:r>
-                          <m:t>x</m:t>
-                        </m:r>
-                      </m:e>
-                    </m:d>
-                  </m:oMath>
-                </w:p>
-              </w:tc>
-              <w:tc>
-                <w:tcPr>
-                  <w:tcW w:w="870" w:type="dxa"/>
-                </w:tcPr>
-                <w:p>
-                  <w:pPr>
-                    <w:pStyle w:val="Compact"/>
-                    <w:bidi/>
-                    <w:jc w:val="center"/>
-                  </w:pPr>
-                  <m:oMath>
-                    <m:r>
-                      <m:t>0</m:t>
-                    </m:r>
-                  </m:oMath>
-                </w:p>
-              </w:tc>
-              <w:tc>
-                <w:tcPr>
-                  <w:tcW w:w="2295" w:type="dxa"/>
-                </w:tcPr>
-                <w:p>
-                  <w:pPr>
-                    <w:pStyle w:val="Compact"/>
-                    <w:bidi/>
-                    <w:jc w:val="center"/>
-                  </w:pPr>
-                  <m:oMath>
-                    <m:r>
-                      <m:rPr>
-                        <m:sty m:val="p"/>
-                      </m:rPr>
-                      <m:t>+</m:t>
-                    </m:r>
-                  </m:oMath>
-                </w:p>
-              </w:tc>
-              <w:tc>
-                <w:tcPr>
-                  <w:tcW w:w="870" w:type="dxa"/>
-                </w:tcPr>
-                <w:p>
-                  <w:pPr>
-                    <w:pStyle w:val="Compact"/>
-                    <w:bidi/>
-                    <w:jc w:val="center"/>
-                  </w:pPr>
-                  <m:oMath>
-                    <m:r>
-                      <m:t>0</m:t>
-                    </m:r>
-                  </m:oMath>
-                </w:p>
-              </w:tc>
-            </w:tr>
-            <w:tr>
-              <w:tc>
-                <w:tcPr>
-                  <w:tcW w:w="2865" w:type="dxa"/>
-                </w:tcPr>
-                <w:p>
-                  <w:pPr>
-                    <w:pStyle w:val="Compact"/>
-                    <w:bidi/>
-                    <w:jc w:val="center"/>
-                  </w:pPr>
-                  <w:r>
-                    <w:rPr>
-                      <w:rtl/>
-                    </w:rPr>
-                    <w:t xml:space="preserve">الوضع النسبي</w:t>
-                  </w:r>
-                </w:p>
-              </w:tc>
-              <w:tc>
-                <w:tcPr>
-                  <w:tcW w:w="870" w:type="dxa"/>
-                </w:tcPr>
-                <w:p>
-                  <w:pPr>
-                    <w:pStyle w:val="Compact"/>
-                    <w:bidi/>
-                    <w:jc w:val="center"/>
-                  </w:pPr>
-                </w:p>
-              </w:tc>
-              <w:tc>
-                <w:tcPr>
-                  <w:tcW w:w="2295" w:type="dxa"/>
-                </w:tcPr>
-                <w:p>
-                  <w:pPr>
-                    <w:pStyle w:val="Compact"/>
-                    <w:bidi/>
-                    <w:jc w:val="center"/>
-                  </w:pPr>
-                  <m:oMath>
-                    <m:d>
-                      <m:dPr>
-                        <m:begChr m:val="("/>
-                        <m:endChr m:val=")"/>
-                        <m:sepChr m:val=""/>
-                        <m:grow/>
-                      </m:dPr>
-                      <m:e>
-                        <m:sSub>
-                          <m:e>
-                            <m:r>
-                              <m:t>C</m:t>
-                            </m:r>
-                          </m:e>
-                          <m:sub>
-                            <m:r>
-                              <m:t>f</m:t>
-                            </m:r>
-                          </m:sub>
-                        </m:sSub>
-                      </m:e>
-                    </m:d>
-                  </m:oMath>
-                  <w:r>
-                    <w:rPr>
-                      <w:rtl/>
-                    </w:rPr>
-                    <w:t xml:space="preserve"> </w:t>
-                  </w:r>
-                  <w:r>
-                    <w:rPr>
-                      <w:rtl/>
-                    </w:rPr>
-                    <w:t xml:space="preserve">فوق</w:t>
-                  </w:r>
-                  <w:r>
-                    <w:rPr>
-                      <w:rtl/>
-                    </w:rPr>
-                    <w:t xml:space="preserve"> </w:t>
-                  </w:r>
-                  <m:oMath>
-                    <m:d>
-                      <m:dPr>
-                        <m:begChr m:val="("/>
-                        <m:endChr m:val=")"/>
-                        <m:sepChr m:val=""/>
-                        <m:grow/>
-                      </m:dPr>
-                      <m:e>
-                        <m:sSub>
-                          <m:e>
-                            <m:r>
-                              <m:t>C</m:t>
-                            </m:r>
-                          </m:e>
-                          <m:sub>
-                            <m:r>
-                              <m:t>g</m:t>
-                            </m:r>
-                          </m:sub>
-                        </m:sSub>
-                      </m:e>
-                    </m:d>
-                  </m:oMath>
-                </w:p>
-              </w:tc>
-              <w:tc>
-                <w:tcPr>
-                  <w:tcW w:w="870" w:type="dxa"/>
-                </w:tcPr>
-                <w:p>
-                  <w:pPr>
-                    <w:pStyle w:val="Compact"/>
-                    <w:bidi/>
-                    <w:jc w:val="center"/>
-                  </w:pPr>
-                </w:p>
-              </w:tc>
-            </w:tr>
-          </w:tbl>
           <w:p>
             <w:pPr>
               <w:bidi/>
-              <w:spacing w:before="120"/>
               <w:jc w:val="center"/>
             </w:pPr>
             <w:r>
@@ -22044,8 +21271,8 @@
               </w:rPr>
               <w:drawing>
                 <wp:inline>
-                  <wp:extent cx="2441448" cy="1371600"/>
-                  <wp:docPr id="5" name="Picture 5"/>
+                  <wp:extent cx="5628132" cy="1700784"/>
+                  <wp:docPr id="6" name="Picture 6"/>
                   <wp:cNvGraphicFramePr>
                     <a:graphicFrameLocks noChangeAspect="1"/>
                   </wp:cNvGraphicFramePr>
@@ -22053,11 +21280,54 @@
                     <a:graphicData uri="http://schemas.openxmlformats.org/drawingml/2006/picture">
                       <pic:pic>
                         <pic:nvPicPr>
-                          <pic:cNvPr id="0" name="cbe0ecc641ae9694.png"/>
+                          <pic:cNvPr id="0" name="5daa57ce54ef3299.png"/>
                           <pic:cNvPicPr/>
                         </pic:nvPicPr>
                         <pic:blipFill>
-                          <a:blip r:embed="rId13"/>
+                          <a:blip r:embed="rId14"/>
+                          <a:stretch>
+                            <a:fillRect/>
+                          </a:stretch>
+                        </pic:blipFill>
+                        <pic:spPr>
+                          <a:xfrm>
+                            <a:off x="0" y="0"/>
+                            <a:ext cx="5628132" cy="1700784"/>
+                          </a:xfrm>
+                          <a:prstGeom prst="rect"/>
+                        </pic:spPr>
+                      </pic:pic>
+                    </a:graphicData>
+                  </a:graphic>
+                </wp:inline>
+              </w:drawing>
+            </w:r>
+          </w:p>
+          <w:p>
+            <w:pPr>
+              <w:bidi/>
+              <w:jc w:val="center"/>
+            </w:pPr>
+            <w:r>
+              <w:rPr>
+                <w:rtl/>
+              </w:rPr>
+              <w:drawing>
+                <wp:inline>
+                  <wp:extent cx="2441448" cy="1371600"/>
+                  <wp:docPr id="7" name="Picture 7"/>
+                  <wp:cNvGraphicFramePr>
+                    <a:graphicFrameLocks noChangeAspect="1"/>
+                  </wp:cNvGraphicFramePr>
+                  <a:graphic>
+                    <a:graphicData uri="http://schemas.openxmlformats.org/drawingml/2006/picture">
+                      <pic:pic>
+                        <pic:nvPicPr>
+                          <pic:cNvPr id="0" name="68c787aa7c4d8bea.png"/>
+                          <pic:cNvPicPr/>
+                        </pic:nvPicPr>
+                        <pic:blipFill>
+                          <a:blip r:embed="rId15"/>
                           <a:stretch>
                             <a:fillRect/>
                           </a:stretch>
@@ -24465,7 +23735,7 @@
               <w:drawing>
                 <wp:inline>
                   <wp:extent cx="2816352" cy="1668780"/>
-                  <wp:docPr id="6" name="Picture 6"/>
+                  <wp:docPr id="8" name="Picture 8"/>
                   <wp:cNvGraphicFramePr>
                     <a:graphicFrameLocks noChangeAspect="1"/>
                   </wp:cNvGraphicFramePr>
@@ -24473,11 +23743,11 @@
                     <a:graphicData uri="http://schemas.openxmlformats.org/drawingml/2006/picture">
                       <pic:pic>
                         <pic:nvPicPr>
-                          <pic:cNvPr id="0" name="bbb5f0b18b807e59.png"/>
+                          <pic:cNvPr id="0" name="4f7000718a650591.png"/>
                           <pic:cNvPicPr/>
                         </pic:nvPicPr>
                         <pic:blipFill>
-                          <a:blip r:embed="rId14"/>
+                          <a:blip r:embed="rId16"/>
                           <a:stretch>
                             <a:fillRect/>
                           </a:stretch>
@@ -25644,486 +24914,52 @@
               <w:t xml:space="preserve">:</w:t>
             </w:r>
           </w:p>
-          <w:tbl>
-            <w:tblPr>
-              <w:tblStyle w:val="Table"/>
-              <w:tblW w:w="9521" w:type="dxa"/>
-              <w:jc w:val="center"/>
-              <w:tblBorders>
-                <w:top w:val="single" w:sz="4" w:space="0" w:color="000000"/>
-                <w:left w:val="single" w:sz="4" w:space="0" w:color="000000"/>
-                <w:bottom w:val="single" w:sz="4" w:space="0" w:color="000000"/>
-                <w:right w:val="single" w:sz="4" w:space="0" w:color="000000"/>
-                <w:insideH w:val="single" w:sz="4" w:space="0" w:color="000000"/>
-                <w:insideV w:val="single" w:sz="4" w:space="0" w:color="000000"/>
-              </w:tblBorders>
-              <w:tblLayout w:type="fixed"/>
-              <w:tblLook w:firstRow="1" w:lastRow="0" w:firstColumn="0" w:lastColumn="0" w:noHBand="0" w:noVBand="0" w:val="0020"/>
-            </w:tblPr>
-            <w:tblGrid>
-              <w:gridCol w:w="2612"/>
-              <w:gridCol w:w="793"/>
-              <w:gridCol w:w="2265"/>
-              <w:gridCol w:w="793"/>
-              <w:gridCol w:w="2265"/>
-              <w:gridCol w:w="793"/>
-            </w:tblGrid>
-            <w:tr>
-              <w:trPr>
-                <w:tblHeader w:val="true"/>
-              </w:trPr>
-              <w:tc>
-                <w:tcPr>
-                  <w:tcW w:w="2612" w:type="dxa"/>
-                  <w:shd w:val="clear" w:color="auto" w:fill="E4E7ED"/>
-                </w:tcPr>
-                <w:p>
-                  <w:pPr>
-                    <w:pStyle w:val="Compact"/>
-                    <w:bidi/>
-                    <w:jc w:val="center"/>
-                  </w:pPr>
-                  <w:r>
-                    <w:rPr>
-                      <w:rtl/>
-                    </w:rPr>
-                    <w:t xml:space="preserve"/>
-                  </w:r>
-                  <m:oMath>
-                    <m:r>
-                      <m:t>x</m:t>
-                    </m:r>
-                  </m:oMath>
-                </w:p>
-              </w:tc>
-              <w:tc>
-                <w:tcPr>
-                  <w:tcW w:w="793" w:type="dxa"/>
-                  <w:shd w:val="clear" w:color="auto" w:fill="E4E7ED"/>
-                </w:tcPr>
-                <w:p>
-                  <w:pPr>
-                    <w:pStyle w:val="Compact"/>
-                    <w:bidi/>
-                    <w:jc w:val="center"/>
-                  </w:pPr>
-                  <m:oMath>
-                    <m:r>
-                      <m:t>0</m:t>
-                    </m:r>
-                  </m:oMath>
-                </w:p>
-              </w:tc>
-              <w:tc>
-                <w:tcPr>
-                  <w:tcW w:w="2265" w:type="dxa"/>
-                  <w:shd w:val="clear" w:color="auto" w:fill="E4E7ED"/>
-                </w:tcPr>
-                <w:p>
-                  <w:pPr>
-                    <w:pStyle w:val="Compact"/>
-                    <w:bidi/>
-                    <w:jc w:val="center"/>
-                  </w:pPr>
-                </w:p>
-              </w:tc>
-              <w:tc>
-                <w:tcPr>
-                  <w:tcW w:w="793" w:type="dxa"/>
-                  <w:shd w:val="clear" w:color="auto" w:fill="E4E7ED"/>
-                </w:tcPr>
-                <w:p>
-                  <w:pPr>
-                    <w:pStyle w:val="Compact"/>
-                    <w:bidi/>
-                    <w:jc w:val="center"/>
-                  </w:pPr>
-                  <m:oMath>
-                    <m:r>
-                      <m:t>1</m:t>
-                    </m:r>
-                  </m:oMath>
-                </w:p>
-              </w:tc>
-              <w:tc>
-                <w:tcPr>
-                  <w:tcW w:w="2265" w:type="dxa"/>
-                  <w:shd w:val="clear" w:color="auto" w:fill="E4E7ED"/>
-                </w:tcPr>
-                <w:p>
-                  <w:pPr>
-                    <w:pStyle w:val="Compact"/>
-                    <w:bidi/>
-                    <w:jc w:val="center"/>
-                  </w:pPr>
-                </w:p>
-              </w:tc>
-              <w:tc>
-                <w:tcPr>
-                  <w:tcW w:w="793" w:type="dxa"/>
-                  <w:shd w:val="clear" w:color="auto" w:fill="E4E7ED"/>
-                </w:tcPr>
-                <w:p>
-                  <w:pPr>
-                    <w:pStyle w:val="Compact"/>
-                    <w:bidi/>
-                    <w:jc w:val="center"/>
-                  </w:pPr>
-                  <m:oMath>
-                    <m:r>
-                      <m:t>3</m:t>
-                    </m:r>
-                  </m:oMath>
-                </w:p>
-              </w:tc>
-            </w:tr>
-            <w:tr>
-              <w:tc>
-                <w:tcPr>
-                  <w:tcW w:w="2612" w:type="dxa"/>
-                </w:tcPr>
-                <w:p>
-                  <w:pPr>
-                    <w:pStyle w:val="Compact"/>
-                    <w:bidi/>
-                    <w:jc w:val="center"/>
-                  </w:pPr>
-                  <w:r>
-                    <w:rPr>
-                      <w:rtl/>
-                    </w:rPr>
-                    <w:t xml:space="preserve">إشارة</w:t>
-                  </w:r>
-                  <w:r>
-                    <w:rPr>
-                      <w:rtl/>
-                    </w:rPr>
-                    <w:t xml:space="preserve"> </w:t>
-                  </w:r>
-                  <m:oMath>
-                    <m:r>
-                      <m:t>f</m:t>
-                    </m:r>
-                    <m:d>
-                      <m:dPr>
-                        <m:begChr m:val="("/>
-                        <m:endChr m:val=")"/>
-                        <m:sepChr m:val=""/>
-                        <m:grow/>
-                      </m:dPr>
-                      <m:e>
-                        <m:r>
-                          <m:t>x</m:t>
-                        </m:r>
-                      </m:e>
-                    </m:d>
-                  </m:oMath>
-                </w:p>
-              </w:tc>
-              <w:tc>
-                <w:tcPr>
-                  <w:tcW w:w="793" w:type="dxa"/>
-                </w:tcPr>
-                <w:p>
-                  <w:pPr>
-                    <w:pStyle w:val="Compact"/>
-                    <w:bidi/>
-                    <w:jc w:val="center"/>
-                  </w:pPr>
-                </w:p>
-              </w:tc>
-              <w:tc>
-                <w:tcPr>
-                  <w:tcW w:w="2265" w:type="dxa"/>
-                </w:tcPr>
-                <w:p>
-                  <w:pPr>
-                    <w:pStyle w:val="Compact"/>
-                    <w:bidi/>
-                    <w:jc w:val="center"/>
-                  </w:pPr>
-                  <m:oMath>
-                    <m:r>
-                      <m:rPr>
-                        <m:sty m:val="p"/>
-                      </m:rPr>
-                      <m:t>+</m:t>
-                    </m:r>
-                  </m:oMath>
-                </w:p>
-              </w:tc>
-              <w:tc>
-                <w:tcPr>
-                  <w:tcW w:w="793" w:type="dxa"/>
-                </w:tcPr>
-                <w:p>
-                  <w:pPr>
-                    <w:pStyle w:val="Compact"/>
-                    <w:bidi/>
-                    <w:jc w:val="center"/>
-                  </w:pPr>
-                  <m:oMath>
-                    <m:r>
-                      <m:t>0</m:t>
-                    </m:r>
-                  </m:oMath>
-                </w:p>
-              </w:tc>
-              <w:tc>
-                <w:tcPr>
-                  <w:tcW w:w="2265" w:type="dxa"/>
-                </w:tcPr>
-                <w:p>
-                  <w:pPr>
-                    <w:pStyle w:val="Compact"/>
-                    <w:bidi/>
-                    <w:jc w:val="center"/>
-                  </w:pPr>
-                  <m:oMath>
-                    <m:r>
-                      <m:rPr>
-                        <m:sty m:val="p"/>
-                      </m:rPr>
-                      <m:t>−</m:t>
-                    </m:r>
-                  </m:oMath>
-                </w:p>
-              </w:tc>
-              <w:tc>
-                <w:tcPr>
-                  <w:tcW w:w="793" w:type="dxa"/>
-                </w:tcPr>
-                <w:p>
-                  <w:pPr>
-                    <w:pStyle w:val="Compact"/>
-                    <w:bidi/>
-                    <w:jc w:val="center"/>
-                  </w:pPr>
-                  <m:oMath>
-                    <m:r>
-                      <m:t>0</m:t>
-                    </m:r>
-                  </m:oMath>
-                </w:p>
-              </w:tc>
-            </w:tr>
-            <w:tr>
-              <w:tc>
-                <w:tcPr>
-                  <w:tcW w:w="2612" w:type="dxa"/>
-                </w:tcPr>
-                <w:p>
-                  <w:pPr>
-                    <w:pStyle w:val="Compact"/>
-                    <w:bidi/>
-                    <w:jc w:val="center"/>
-                  </w:pPr>
-                  <w:r>
-                    <w:rPr>
-                      <w:rtl/>
-                    </w:rPr>
-                    <w:t xml:space="preserve">الوضع النسبي</w:t>
-                  </w:r>
-                </w:p>
-              </w:tc>
-              <w:tc>
-                <w:tcPr>
-                  <w:tcW w:w="793" w:type="dxa"/>
-                </w:tcPr>
-                <w:p>
-                  <w:pPr>
-                    <w:pStyle w:val="Compact"/>
-                    <w:bidi/>
-                    <w:jc w:val="center"/>
-                  </w:pPr>
-                </w:p>
-              </w:tc>
-              <w:tc>
-                <w:tcPr>
-                  <w:tcW w:w="2265" w:type="dxa"/>
-                </w:tcPr>
-                <w:p>
-                  <w:pPr>
-                    <w:pStyle w:val="Compact"/>
-                    <w:bidi/>
-                    <w:jc w:val="center"/>
-                  </w:pPr>
-                  <m:oMath>
-                    <m:d>
-                      <m:dPr>
-                        <m:begChr m:val="("/>
-                        <m:endChr m:val=")"/>
-                        <m:sepChr m:val=""/>
-                        <m:grow/>
-                      </m:dPr>
-                      <m:e>
-                        <m:sSub>
-                          <m:e>
-                            <m:r>
-                              <m:t>C</m:t>
-                            </m:r>
-                          </m:e>
-                          <m:sub>
-                            <m:r>
-                              <m:t>f</m:t>
-                            </m:r>
-                          </m:sub>
-                        </m:sSub>
-                      </m:e>
-                    </m:d>
-                  </m:oMath>
-                  <w:r>
-                    <w:rPr>
-                      <w:rtl/>
-                    </w:rPr>
-                    <w:t xml:space="preserve"> </w:t>
-                  </w:r>
-                  <w:r>
-                    <w:rPr>
-                      <w:rtl/>
-                    </w:rPr>
-                    <w:t xml:space="preserve">فوق</w:t>
-                  </w:r>
-                  <w:r>
-                    <w:rPr>
-                      <w:rtl/>
-                    </w:rPr>
-                    <w:t xml:space="preserve"> </w:t>
-                  </w:r>
-                  <m:oMath>
-                    <m:d>
-                      <m:dPr>
-                        <m:begChr m:val="("/>
-                        <m:endChr m:val=")"/>
-                        <m:sepChr m:val=""/>
-                        <m:grow/>
-                      </m:dPr>
-                      <m:e>
-                        <m:r>
-                          <m:t>x</m:t>
-                        </m:r>
-                        <m:r>
-                          <m:t>x</m:t>
-                        </m:r>
-                        <m:r>
-                          <m:rPr>
-                            <m:sty m:val="p"/>
-                          </m:rPr>
-                          <m:t>′</m:t>
-                        </m:r>
-                      </m:e>
-                    </m:d>
-                  </m:oMath>
-                </w:p>
-              </w:tc>
-              <w:tc>
-                <w:tcPr>
-                  <w:tcW w:w="793" w:type="dxa"/>
-                </w:tcPr>
-                <w:p>
-                  <w:pPr>
-                    <w:pStyle w:val="Compact"/>
-                    <w:bidi/>
-                    <w:jc w:val="center"/>
-                  </w:pPr>
-                </w:p>
-              </w:tc>
-              <w:tc>
-                <w:tcPr>
-                  <w:tcW w:w="2265" w:type="dxa"/>
-                </w:tcPr>
-                <w:p>
-                  <w:pPr>
-                    <w:pStyle w:val="Compact"/>
-                    <w:bidi/>
-                    <w:jc w:val="center"/>
-                  </w:pPr>
-                  <m:oMath>
-                    <m:d>
-                      <m:dPr>
-                        <m:begChr m:val="("/>
-                        <m:endChr m:val=")"/>
-                        <m:sepChr m:val=""/>
-                        <m:grow/>
-                      </m:dPr>
-                      <m:e>
-                        <m:sSub>
-                          <m:e>
-                            <m:r>
-                              <m:t>C</m:t>
-                            </m:r>
-                          </m:e>
-                          <m:sub>
-                            <m:r>
-                              <m:t>f</m:t>
-                            </m:r>
-                          </m:sub>
-                        </m:sSub>
-                      </m:e>
-                    </m:d>
-                  </m:oMath>
-                  <w:r>
-                    <w:rPr>
-                      <w:rtl/>
-                    </w:rPr>
-                    <w:t xml:space="preserve"> </w:t>
-                  </w:r>
-                  <w:r>
-                    <w:rPr>
-                      <w:rtl/>
-                    </w:rPr>
-                    <w:t xml:space="preserve">تحت</w:t>
-                  </w:r>
-                  <w:r>
-                    <w:rPr>
-                      <w:rtl/>
-                    </w:rPr>
-                    <w:t xml:space="preserve"> </w:t>
-                  </w:r>
-                  <m:oMath>
-                    <m:d>
-                      <m:dPr>
-                        <m:begChr m:val="("/>
-                        <m:endChr m:val=")"/>
-                        <m:sepChr m:val=""/>
-                        <m:grow/>
-                      </m:dPr>
-                      <m:e>
-                        <m:r>
-                          <m:t>x</m:t>
-                        </m:r>
-                        <m:r>
-                          <m:t>x</m:t>
-                        </m:r>
-                        <m:r>
-                          <m:rPr>
-                            <m:sty m:val="p"/>
-                          </m:rPr>
-                          <m:t>′</m:t>
-                        </m:r>
-                      </m:e>
-                    </m:d>
-                  </m:oMath>
-                </w:p>
-              </w:tc>
-              <w:tc>
-                <w:tcPr>
-                  <w:tcW w:w="793" w:type="dxa"/>
-                </w:tcPr>
-                <w:p>
-                  <w:pPr>
-                    <w:pStyle w:val="Compact"/>
-                    <w:bidi/>
-                    <w:jc w:val="center"/>
-                  </w:pPr>
-                </w:p>
-              </w:tc>
-            </w:tr>
-          </w:tbl>
           <w:p>
             <w:pPr>
               <w:bidi/>
-              <w:spacing w:before="120"/>
+              <w:jc w:val="center"/>
+            </w:pPr>
+            <w:r>
+              <w:rPr>
+                <w:rtl/>
+              </w:rPr>
+              <w:drawing>
+                <wp:inline>
+                  <wp:extent cx="5628132" cy="1700784"/>
+                  <wp:docPr id="9" name="Picture 9"/>
+                  <wp:cNvGraphicFramePr>
+                    <a:graphicFrameLocks noChangeAspect="1"/>
+                  </wp:cNvGraphicFramePr>
+                  <a:graphic>
+                    <a:graphicData uri="http://schemas.openxmlformats.org/drawingml/2006/picture">
+                      <pic:pic>
+                        <pic:nvPicPr>
+                          <pic:cNvPr id="0" name="ce66728bfba5b275.png"/>
+                          <pic:cNvPicPr/>
+                        </pic:nvPicPr>
+                        <pic:blipFill>
+                          <a:blip r:embed="rId17"/>
+                          <a:stretch>
+                            <a:fillRect/>
+                          </a:stretch>
+                        </pic:blipFill>
+                        <pic:spPr>
+                          <a:xfrm>
+                            <a:off x="0" y="0"/>
+                            <a:ext cx="5628132" cy="1700784"/>
+                          </a:xfrm>
+                          <a:prstGeom prst="rect"/>
+                        </pic:spPr>
+                      </pic:pic>
+                    </a:graphicData>
+                  </a:graphic>
+                </wp:inline>
+              </w:drawing>
+            </w:r>
+          </w:p>
+          <w:p>
+            <w:pPr>
+              <w:bidi/>
             </w:pPr>
             <m:oMathPara>
               <m:oMathParaPr>
@@ -27010,681 +25846,52 @@
               <w:t xml:space="preserve">:</w:t>
             </w:r>
           </w:p>
-          <w:tbl>
-            <w:tblPr>
-              <w:tblStyle w:val="Table"/>
-              <w:tblW w:w="9519" w:type="dxa"/>
-              <w:jc w:val="center"/>
-              <w:tblBorders>
-                <w:top w:val="single" w:sz="4" w:space="0" w:color="000000"/>
-                <w:left w:val="single" w:sz="4" w:space="0" w:color="000000"/>
-                <w:bottom w:val="single" w:sz="4" w:space="0" w:color="000000"/>
-                <w:right w:val="single" w:sz="4" w:space="0" w:color="000000"/>
-                <w:insideH w:val="single" w:sz="4" w:space="0" w:color="000000"/>
-                <w:insideV w:val="single" w:sz="4" w:space="0" w:color="000000"/>
-              </w:tblBorders>
-              <w:tblLayout w:type="fixed"/>
-              <w:tblLook w:firstRow="1" w:lastRow="0" w:firstColumn="0" w:lastColumn="0" w:noHBand="0" w:noVBand="0" w:val="0020"/>
-            </w:tblPr>
-            <w:tblGrid>
-              <w:gridCol w:w="2033"/>
-              <w:gridCol w:w="684"/>
-              <w:gridCol w:w="1628"/>
-              <w:gridCol w:w="617"/>
-              <w:gridCol w:w="1628"/>
-              <w:gridCol w:w="617"/>
-              <w:gridCol w:w="1628"/>
-              <w:gridCol w:w="684"/>
-            </w:tblGrid>
-            <w:tr>
-              <w:trPr>
-                <w:tblHeader w:val="true"/>
-              </w:trPr>
-              <w:tc>
-                <w:tcPr>
-                  <w:tcW w:w="2033" w:type="dxa"/>
-                  <w:shd w:val="clear" w:color="auto" w:fill="E4E7ED"/>
-                </w:tcPr>
-                <w:p>
-                  <w:pPr>
-                    <w:pStyle w:val="Compact"/>
-                    <w:bidi/>
-                    <w:jc w:val="center"/>
-                  </w:pPr>
-                  <w:r>
-                    <w:rPr>
-                      <w:rtl/>
-                    </w:rPr>
-                    <w:t xml:space="preserve"/>
-                  </w:r>
-                  <m:oMath>
-                    <m:r>
-                      <m:t>x</m:t>
-                    </m:r>
-                  </m:oMath>
-                </w:p>
-              </w:tc>
-              <w:tc>
-                <w:tcPr>
-                  <w:tcW w:w="684" w:type="dxa"/>
-                  <w:shd w:val="clear" w:color="auto" w:fill="E4E7ED"/>
-                </w:tcPr>
-                <w:p>
-                  <w:pPr>
-                    <w:pStyle w:val="Compact"/>
-                    <w:bidi/>
-                    <w:jc w:val="center"/>
-                  </w:pPr>
-                  <m:oMath>
-                    <m:r>
-                      <m:rPr>
-                        <m:sty m:val="p"/>
-                      </m:rPr>
-                      <m:t>−</m:t>
-                    </m:r>
-                    <m:r>
-                      <m:rPr>
-                        <m:sty m:val="p"/>
-                      </m:rPr>
-                      <m:t>∞</m:t>
-                    </m:r>
-                  </m:oMath>
-                </w:p>
-              </w:tc>
-              <w:tc>
-                <w:tcPr>
-                  <w:tcW w:w="1628" w:type="dxa"/>
-                  <w:shd w:val="clear" w:color="auto" w:fill="E4E7ED"/>
-                </w:tcPr>
-                <w:p>
-                  <w:pPr>
-                    <w:pStyle w:val="Compact"/>
-                    <w:bidi/>
-                    <w:jc w:val="center"/>
-                  </w:pPr>
-                </w:p>
-              </w:tc>
-              <w:tc>
-                <w:tcPr>
-                  <w:tcW w:w="617" w:type="dxa"/>
-                  <w:shd w:val="clear" w:color="auto" w:fill="E4E7ED"/>
-                </w:tcPr>
-                <w:p>
-                  <w:pPr>
-                    <w:pStyle w:val="Compact"/>
-                    <w:bidi/>
-                    <w:jc w:val="center"/>
-                  </w:pPr>
-                  <m:oMath>
-                    <m:r>
-                      <m:t>1</m:t>
-                    </m:r>
-                  </m:oMath>
-                </w:p>
-              </w:tc>
-              <w:tc>
-                <w:tcPr>
-                  <w:tcW w:w="1628" w:type="dxa"/>
-                  <w:shd w:val="clear" w:color="auto" w:fill="E4E7ED"/>
-                </w:tcPr>
-                <w:p>
-                  <w:pPr>
-                    <w:pStyle w:val="Compact"/>
-                    <w:bidi/>
-                    <w:jc w:val="center"/>
-                  </w:pPr>
-                </w:p>
-              </w:tc>
-              <w:tc>
-                <w:tcPr>
-                  <w:tcW w:w="617" w:type="dxa"/>
-                  <w:shd w:val="clear" w:color="auto" w:fill="E4E7ED"/>
-                </w:tcPr>
-                <w:p>
-                  <w:pPr>
-                    <w:pStyle w:val="Compact"/>
-                    <w:bidi/>
-                    <w:jc w:val="center"/>
-                  </w:pPr>
-                  <m:oMath>
-                    <m:r>
-                      <m:t>4</m:t>
-                    </m:r>
-                  </m:oMath>
-                </w:p>
-              </w:tc>
-              <w:tc>
-                <w:tcPr>
-                  <w:tcW w:w="1628" w:type="dxa"/>
-                  <w:shd w:val="clear" w:color="auto" w:fill="E4E7ED"/>
-                </w:tcPr>
-                <w:p>
-                  <w:pPr>
-                    <w:pStyle w:val="Compact"/>
-                    <w:bidi/>
-                    <w:jc w:val="center"/>
-                  </w:pPr>
-                </w:p>
-              </w:tc>
-              <w:tc>
-                <w:tcPr>
-                  <w:tcW w:w="684" w:type="dxa"/>
-                  <w:shd w:val="clear" w:color="auto" w:fill="E4E7ED"/>
-                </w:tcPr>
-                <w:p>
-                  <w:pPr>
-                    <w:pStyle w:val="Compact"/>
-                    <w:bidi/>
-                    <w:jc w:val="center"/>
-                  </w:pPr>
-                  <m:oMath>
-                    <m:r>
-                      <m:rPr>
-                        <m:sty m:val="p"/>
-                      </m:rPr>
-                      <m:t>+</m:t>
-                    </m:r>
-                    <m:r>
-                      <m:rPr>
-                        <m:sty m:val="p"/>
-                      </m:rPr>
-                      <m:t>∞</m:t>
-                    </m:r>
-                  </m:oMath>
-                </w:p>
-              </w:tc>
-            </w:tr>
-            <w:tr>
-              <w:tc>
-                <w:tcPr>
-                  <w:tcW w:w="2033" w:type="dxa"/>
-                </w:tcPr>
-                <w:p>
-                  <w:pPr>
-                    <w:pStyle w:val="Compact"/>
-                    <w:bidi/>
-                    <w:jc w:val="center"/>
-                  </w:pPr>
-                  <w:r>
-                    <w:rPr>
-                      <w:rtl/>
-                    </w:rPr>
-                    <w:t xml:space="preserve">إشارة</w:t>
-                  </w:r>
-                  <w:r>
-                    <w:rPr>
-                      <w:rtl/>
-                    </w:rPr>
-                    <w:t xml:space="preserve"> </w:t>
-                  </w:r>
-                  <m:oMath>
-                    <m:r>
-                      <m:t>f</m:t>
-                    </m:r>
-                    <m:d>
-                      <m:dPr>
-                        <m:begChr m:val="("/>
-                        <m:endChr m:val=")"/>
-                        <m:sepChr m:val=""/>
-                        <m:grow/>
-                      </m:dPr>
-                      <m:e>
-                        <m:r>
-                          <m:t>x</m:t>
-                        </m:r>
-                      </m:e>
-                    </m:d>
-                    <m:r>
-                      <m:rPr>
-                        <m:sty m:val="p"/>
-                      </m:rPr>
-                      <m:t>−</m:t>
-                    </m:r>
-                    <m:r>
-                      <m:t>g</m:t>
-                    </m:r>
-                    <m:d>
-                      <m:dPr>
-                        <m:begChr m:val="("/>
-                        <m:endChr m:val=")"/>
-                        <m:sepChr m:val=""/>
-                        <m:grow/>
-                      </m:dPr>
-                      <m:e>
-                        <m:r>
-                          <m:t>x</m:t>
-                        </m:r>
-                      </m:e>
-                    </m:d>
-                  </m:oMath>
-                </w:p>
-              </w:tc>
-              <w:tc>
-                <w:tcPr>
-                  <w:tcW w:w="684" w:type="dxa"/>
-                </w:tcPr>
-                <w:p>
-                  <w:pPr>
-                    <w:pStyle w:val="Compact"/>
-                    <w:bidi/>
-                    <w:jc w:val="center"/>
-                  </w:pPr>
-                </w:p>
-              </w:tc>
-              <w:tc>
-                <w:tcPr>
-                  <w:tcW w:w="1628" w:type="dxa"/>
-                </w:tcPr>
-                <w:p>
-                  <w:pPr>
-                    <w:pStyle w:val="Compact"/>
-                    <w:bidi/>
-                    <w:jc w:val="center"/>
-                  </w:pPr>
-                  <m:oMath>
-                    <m:r>
-                      <m:rPr>
-                        <m:sty m:val="p"/>
-                      </m:rPr>
-                      <m:t>+</m:t>
-                    </m:r>
-                  </m:oMath>
-                </w:p>
-              </w:tc>
-              <w:tc>
-                <w:tcPr>
-                  <w:tcW w:w="617" w:type="dxa"/>
-                </w:tcPr>
-                <w:p>
-                  <w:pPr>
-                    <w:pStyle w:val="Compact"/>
-                    <w:bidi/>
-                    <w:jc w:val="center"/>
-                  </w:pPr>
-                  <m:oMath>
-                    <m:r>
-                      <m:t>0</m:t>
-                    </m:r>
-                  </m:oMath>
-                </w:p>
-              </w:tc>
-              <w:tc>
-                <w:tcPr>
-                  <w:tcW w:w="1628" w:type="dxa"/>
-                </w:tcPr>
-                <w:p>
-                  <w:pPr>
-                    <w:pStyle w:val="Compact"/>
-                    <w:bidi/>
-                    <w:jc w:val="center"/>
-                  </w:pPr>
-                  <m:oMath>
-                    <m:r>
-                      <m:rPr>
-                        <m:sty m:val="p"/>
-                      </m:rPr>
-                      <m:t>−</m:t>
-                    </m:r>
-                  </m:oMath>
-                </w:p>
-              </w:tc>
-              <w:tc>
-                <w:tcPr>
-                  <w:tcW w:w="617" w:type="dxa"/>
-                </w:tcPr>
-                <w:p>
-                  <w:pPr>
-                    <w:pStyle w:val="Compact"/>
-                    <w:bidi/>
-                    <w:jc w:val="center"/>
-                  </w:pPr>
-                  <m:oMath>
-                    <m:r>
-                      <m:t>0</m:t>
-                    </m:r>
-                  </m:oMath>
-                </w:p>
-              </w:tc>
-              <w:tc>
-                <w:tcPr>
-                  <w:tcW w:w="1628" w:type="dxa"/>
-                </w:tcPr>
-                <w:p>
-                  <w:pPr>
-                    <w:pStyle w:val="Compact"/>
-                    <w:bidi/>
-                    <w:jc w:val="center"/>
-                  </w:pPr>
-                  <m:oMath>
-                    <m:r>
-                      <m:rPr>
-                        <m:sty m:val="p"/>
-                      </m:rPr>
-                      <m:t>+</m:t>
-                    </m:r>
-                  </m:oMath>
-                </w:p>
-              </w:tc>
-              <w:tc>
-                <w:tcPr>
-                  <w:tcW w:w="684" w:type="dxa"/>
-                </w:tcPr>
-                <w:p>
-                  <w:pPr>
-                    <w:pStyle w:val="Compact"/>
-                    <w:bidi/>
-                    <w:jc w:val="center"/>
-                  </w:pPr>
-                </w:p>
-              </w:tc>
-            </w:tr>
-            <w:tr>
-              <w:tc>
-                <w:tcPr>
-                  <w:tcW w:w="2033" w:type="dxa"/>
-                </w:tcPr>
-                <w:p>
-                  <w:pPr>
-                    <w:pStyle w:val="Compact"/>
-                    <w:bidi/>
-                    <w:jc w:val="center"/>
-                  </w:pPr>
-                  <w:r>
-                    <w:rPr>
-                      <w:rtl/>
-                    </w:rPr>
-                    <w:t xml:space="preserve">الوضع النسبي</w:t>
-                  </w:r>
-                </w:p>
-              </w:tc>
-              <w:tc>
-                <w:tcPr>
-                  <w:tcW w:w="684" w:type="dxa"/>
-                </w:tcPr>
-                <w:p>
-                  <w:pPr>
-                    <w:pStyle w:val="Compact"/>
-                    <w:bidi/>
-                    <w:jc w:val="center"/>
-                  </w:pPr>
-                </w:p>
-              </w:tc>
-              <w:tc>
-                <w:tcPr>
-                  <w:tcW w:w="1628" w:type="dxa"/>
-                </w:tcPr>
-                <w:p>
-                  <w:pPr>
-                    <w:pStyle w:val="Compact"/>
-                    <w:bidi/>
-                    <w:jc w:val="center"/>
-                  </w:pPr>
-                  <m:oMath>
-                    <m:d>
-                      <m:dPr>
-                        <m:begChr m:val="("/>
-                        <m:endChr m:val=")"/>
-                        <m:sepChr m:val=""/>
-                        <m:grow/>
-                      </m:dPr>
-                      <m:e>
-                        <m:sSub>
-                          <m:e>
-                            <m:r>
-                              <m:t>C</m:t>
-                            </m:r>
-                          </m:e>
-                          <m:sub>
-                            <m:r>
-                              <m:t>f</m:t>
-                            </m:r>
-                          </m:sub>
-                        </m:sSub>
-                      </m:e>
-                    </m:d>
-                  </m:oMath>
-                  <w:r>
-                    <w:rPr>
-                      <w:rtl/>
-                    </w:rPr>
-                    <w:t xml:space="preserve"> </w:t>
-                  </w:r>
-                  <w:r>
-                    <w:rPr>
-                      <w:rtl/>
-                    </w:rPr>
-                    <w:t xml:space="preserve">فوق</w:t>
-                  </w:r>
-                  <w:r>
-                    <w:rPr>
-                      <w:rtl/>
-                    </w:rPr>
-                    <w:t xml:space="preserve"> </w:t>
-                  </w:r>
-                  <m:oMath>
-                    <m:d>
-                      <m:dPr>
-                        <m:begChr m:val="("/>
-                        <m:endChr m:val=")"/>
-                        <m:sepChr m:val=""/>
-                        <m:grow/>
-                      </m:dPr>
-                      <m:e>
-                        <m:sSub>
-                          <m:e>
-                            <m:r>
-                              <m:t>C</m:t>
-                            </m:r>
-                          </m:e>
-                          <m:sub>
-                            <m:r>
-                              <m:t>g</m:t>
-                            </m:r>
-                          </m:sub>
-                        </m:sSub>
-                      </m:e>
-                    </m:d>
-                  </m:oMath>
-                </w:p>
-              </w:tc>
-              <w:tc>
-                <w:tcPr>
-                  <w:tcW w:w="617" w:type="dxa"/>
-                </w:tcPr>
-                <w:p>
-                  <w:pPr>
-                    <w:pStyle w:val="Compact"/>
-                    <w:bidi/>
-                    <w:jc w:val="center"/>
-                  </w:pPr>
-                </w:p>
-              </w:tc>
-              <w:tc>
-                <w:tcPr>
-                  <w:tcW w:w="1628" w:type="dxa"/>
-                </w:tcPr>
-                <w:p>
-                  <w:pPr>
-                    <w:pStyle w:val="Compact"/>
-                    <w:bidi/>
-                    <w:jc w:val="center"/>
-                  </w:pPr>
-                  <m:oMath>
-                    <m:d>
-                      <m:dPr>
-                        <m:begChr m:val="("/>
-                        <m:endChr m:val=")"/>
-                        <m:sepChr m:val=""/>
-                        <m:grow/>
-                      </m:dPr>
-                      <m:e>
-                        <m:sSub>
-                          <m:e>
-                            <m:r>
-                              <m:t>C</m:t>
-                            </m:r>
-                          </m:e>
-                          <m:sub>
-                            <m:r>
-                              <m:t>f</m:t>
-                            </m:r>
-                          </m:sub>
-                        </m:sSub>
-                      </m:e>
-                    </m:d>
-                  </m:oMath>
-                  <w:r>
-                    <w:rPr>
-                      <w:rtl/>
-                    </w:rPr>
-                    <w:t xml:space="preserve"> </w:t>
-                  </w:r>
-                  <w:r>
-                    <w:rPr>
-                      <w:rtl/>
-                    </w:rPr>
-                    <w:t xml:space="preserve">تحت</w:t>
-                  </w:r>
-                  <w:r>
-                    <w:rPr>
-                      <w:rtl/>
-                    </w:rPr>
-                    <w:t xml:space="preserve"> </w:t>
-                  </w:r>
-                  <m:oMath>
-                    <m:d>
-                      <m:dPr>
-                        <m:begChr m:val="("/>
-                        <m:endChr m:val=")"/>
-                        <m:sepChr m:val=""/>
-                        <m:grow/>
-                      </m:dPr>
-                      <m:e>
-                        <m:sSub>
-                          <m:e>
-                            <m:r>
-                              <m:t>C</m:t>
-                            </m:r>
-                          </m:e>
-                          <m:sub>
-                            <m:r>
-                              <m:t>g</m:t>
-                            </m:r>
-                          </m:sub>
-                        </m:sSub>
-                      </m:e>
-                    </m:d>
-                  </m:oMath>
-                </w:p>
-              </w:tc>
-              <w:tc>
-                <w:tcPr>
-                  <w:tcW w:w="617" w:type="dxa"/>
-                </w:tcPr>
-                <w:p>
-                  <w:pPr>
-                    <w:pStyle w:val="Compact"/>
-                    <w:bidi/>
-                    <w:jc w:val="center"/>
-                  </w:pPr>
-                </w:p>
-              </w:tc>
-              <w:tc>
-                <w:tcPr>
-                  <w:tcW w:w="1628" w:type="dxa"/>
-                </w:tcPr>
-                <w:p>
-                  <w:pPr>
-                    <w:pStyle w:val="Compact"/>
-                    <w:bidi/>
-                    <w:jc w:val="center"/>
-                  </w:pPr>
-                  <m:oMath>
-                    <m:d>
-                      <m:dPr>
-                        <m:begChr m:val="("/>
-                        <m:endChr m:val=")"/>
-                        <m:sepChr m:val=""/>
-                        <m:grow/>
-                      </m:dPr>
-                      <m:e>
-                        <m:sSub>
-                          <m:e>
-                            <m:r>
-                              <m:t>C</m:t>
-                            </m:r>
-                          </m:e>
-                          <m:sub>
-                            <m:r>
-                              <m:t>f</m:t>
-                            </m:r>
-                          </m:sub>
-                        </m:sSub>
-                      </m:e>
-                    </m:d>
-                  </m:oMath>
-                  <w:r>
-                    <w:rPr>
-                      <w:rtl/>
-                    </w:rPr>
-                    <w:t xml:space="preserve"> </w:t>
-                  </w:r>
-                  <w:r>
-                    <w:rPr>
-                      <w:rtl/>
-                    </w:rPr>
-                    <w:t xml:space="preserve">فوق</w:t>
-                  </w:r>
-                  <w:r>
-                    <w:rPr>
-                      <w:rtl/>
-                    </w:rPr>
-                    <w:t xml:space="preserve"> </w:t>
-                  </w:r>
-                  <m:oMath>
-                    <m:d>
-                      <m:dPr>
-                        <m:begChr m:val="("/>
-                        <m:endChr m:val=")"/>
-                        <m:sepChr m:val=""/>
-                        <m:grow/>
-                      </m:dPr>
-                      <m:e>
-                        <m:sSub>
-                          <m:e>
-                            <m:r>
-                              <m:t>C</m:t>
-                            </m:r>
-                          </m:e>
-                          <m:sub>
-                            <m:r>
-                              <m:t>g</m:t>
-                            </m:r>
-                          </m:sub>
-                        </m:sSub>
-                      </m:e>
-                    </m:d>
-                  </m:oMath>
-                </w:p>
-              </w:tc>
-              <w:tc>
-                <w:tcPr>
-                  <w:tcW w:w="684" w:type="dxa"/>
-                </w:tcPr>
-                <w:p>
-                  <w:pPr>
-                    <w:pStyle w:val="Compact"/>
-                    <w:bidi/>
-                    <w:jc w:val="center"/>
-                  </w:pPr>
-                </w:p>
-              </w:tc>
-            </w:tr>
-          </w:tbl>
           <w:p>
             <w:pPr>
               <w:bidi/>
-              <w:spacing w:before="120"/>
+              <w:jc w:val="center"/>
+            </w:pPr>
+            <w:r>
+              <w:rPr>
+                <w:rtl/>
+              </w:rPr>
+              <w:drawing>
+                <wp:inline>
+                  <wp:extent cx="5628132" cy="1700784"/>
+                  <wp:docPr id="10" name="Picture 10"/>
+                  <wp:cNvGraphicFramePr>
+                    <a:graphicFrameLocks noChangeAspect="1"/>
+                  </wp:cNvGraphicFramePr>
+                  <a:graphic>
+                    <a:graphicData uri="http://schemas.openxmlformats.org/drawingml/2006/picture">
+                      <pic:pic>
+                        <pic:nvPicPr>
+                          <pic:cNvPr id="0" name="cf8f2af6996f0cd2.png"/>
+                          <pic:cNvPicPr/>
+                        </pic:nvPicPr>
+                        <pic:blipFill>
+                          <a:blip r:embed="rId18"/>
+                          <a:stretch>
+                            <a:fillRect/>
+                          </a:stretch>
+                        </pic:blipFill>
+                        <pic:spPr>
+                          <a:xfrm>
+                            <a:off x="0" y="0"/>
+                            <a:ext cx="5628132" cy="1700784"/>
+                          </a:xfrm>
+                          <a:prstGeom prst="rect"/>
+                        </pic:spPr>
+                      </pic:pic>
+                    </a:graphicData>
+                  </a:graphic>
+                </wp:inline>
+              </w:drawing>
+            </w:r>
+          </w:p>
+          <w:p>
+            <w:pPr>
+              <w:bidi/>
             </w:pPr>
             <w:r>
               <w:rPr>
@@ -27833,7 +26040,7 @@
               <w:drawing>
                 <wp:inline>
                   <wp:extent cx="2555748" cy="1431036"/>
-                  <wp:docPr id="7" name="Picture 7"/>
+                  <wp:docPr id="11" name="Picture 11"/>
                   <wp:cNvGraphicFramePr>
                     <a:graphicFrameLocks noChangeAspect="1"/>
                   </wp:cNvGraphicFramePr>
@@ -27841,11 +26048,11 @@
                     <a:graphicData uri="http://schemas.openxmlformats.org/drawingml/2006/picture">
                       <pic:pic>
                         <pic:nvPicPr>
-                          <pic:cNvPr id="0" name="0da3f4a7f09bc722.png"/>
+                          <pic:cNvPr id="0" name="327c36cb3b991034.png"/>
                           <pic:cNvPicPr/>
                         </pic:nvPicPr>
                         <pic:blipFill>
-                          <a:blip r:embed="rId15"/>
+                          <a:blip r:embed="rId19"/>
                           <a:stretch>
                             <a:fillRect/>
                           </a:stretch>
@@ -31005,8 +29212,8 @@
     </w:p>
     <w:bookmarkEnd w:id="30"/>
     <w:sectPr>
-      <w:headerReference w:type="default" r:id="rId16"/>
-      <w:footerReference w:type="default" r:id="rId17"/>
+      <w:headerReference w:type="default" r:id="rId20"/>
+      <w:footerReference w:type="default" r:id="rId21"/>
       <w:pgSz w:h="16838" w:w="11906"/>
       <w:pgMar w:bottom="1134" w:left="964" w:right="964" w:top="1134" w:header="454" w:footer="454" w:gutter="0"/>
     </w:sectPr>

</xml_diff>